<commit_message>
fix : correction syntaxe exercice 5
</commit_message>
<xml_diff>
--- a/Exercice Algorithmie 5.docx
+++ b/Exercice Algorithmie 5.docx
@@ -198,6 +198,21 @@
           <w:szCs w:val="28"/>
         </w:rPr>
       </w:pPr>
+      <w:r>
+        <w:rPr>
+          <w:sz w:val="28"/>
+          <w:szCs w:val="28"/>
+        </w:rPr>
+        <w:t>FIN FONCTION</w:t>
+      </w:r>
+    </w:p>
+    <w:p>
+      <w:pPr>
+        <w:rPr>
+          <w:sz w:val="28"/>
+          <w:szCs w:val="28"/>
+        </w:rPr>
+      </w:pPr>
     </w:p>
     <w:p>
       <w:pPr>
@@ -436,7 +451,7 @@
           <w:sz w:val="28"/>
           <w:szCs w:val="28"/>
         </w:rPr>
-        <w:t xml:space="preserve">Créer TVA </w:t>
+        <w:t xml:space="preserve">TVA </w:t>
       </w:r>
       <w:r>
         <w:rPr>
@@ -513,7 +528,7 @@
           <w:sz w:val="28"/>
           <w:szCs w:val="28"/>
         </w:rPr>
-        <w:t xml:space="preserve">Créer TTC </w:t>
+        <w:t xml:space="preserve">TTC </w:t>
       </w:r>
       <w:r>
         <w:rPr>
@@ -717,6 +732,21 @@
           <w:szCs w:val="28"/>
         </w:rPr>
       </w:pPr>
+      <w:r>
+        <w:rPr>
+          <w:sz w:val="28"/>
+          <w:szCs w:val="28"/>
+        </w:rPr>
+        <w:t>FIN FONCTION</w:t>
+      </w:r>
+    </w:p>
+    <w:p>
+      <w:pPr>
+        <w:rPr>
+          <w:sz w:val="28"/>
+          <w:szCs w:val="28"/>
+        </w:rPr>
+      </w:pPr>
     </w:p>
     <w:p>
       <w:pPr>
@@ -801,6 +831,19 @@
           <w:szCs w:val="28"/>
         </w:rPr>
         <w:tab/>
+      </w:r>
+      <w:r>
+        <w:rPr>
+          <w:sz w:val="28"/>
+          <w:szCs w:val="28"/>
+        </w:rPr>
+        <w:t xml:space="preserve">Sinon </w:t>
+      </w:r>
+      <w:r>
+        <w:rPr>
+          <w:sz w:val="28"/>
+          <w:szCs w:val="28"/>
+        </w:rPr>
         <w:t>SI moyenne &gt;= 14</w:t>
       </w:r>
     </w:p>
@@ -839,7 +882,21 @@
           <w:sz w:val="28"/>
           <w:szCs w:val="28"/>
         </w:rPr>
+        <w:lastRenderedPageBreak/>
         <w:tab/>
+      </w:r>
+      <w:r>
+        <w:rPr>
+          <w:sz w:val="28"/>
+          <w:szCs w:val="28"/>
+        </w:rPr>
+        <w:t xml:space="preserve">Sinon </w:t>
+      </w:r>
+      <w:r>
+        <w:rPr>
+          <w:sz w:val="28"/>
+          <w:szCs w:val="28"/>
+        </w:rPr>
         <w:t>SI moyenne &gt;= 12</w:t>
       </w:r>
     </w:p>
@@ -892,8 +949,20 @@
           <w:sz w:val="28"/>
           <w:szCs w:val="28"/>
         </w:rPr>
-        <w:lastRenderedPageBreak/>
         <w:tab/>
+      </w:r>
+      <w:r>
+        <w:rPr>
+          <w:sz w:val="28"/>
+          <w:szCs w:val="28"/>
+        </w:rPr>
+        <w:t xml:space="preserve">Sinon </w:t>
+      </w:r>
+      <w:r>
+        <w:rPr>
+          <w:sz w:val="28"/>
+          <w:szCs w:val="28"/>
+        </w:rPr>
         <w:t>Si moyenne &gt;=</w:t>
       </w:r>
       <w:r>
@@ -947,6 +1016,19 @@
           <w:szCs w:val="28"/>
         </w:rPr>
         <w:tab/>
+      </w:r>
+      <w:r>
+        <w:rPr>
+          <w:sz w:val="28"/>
+          <w:szCs w:val="28"/>
+        </w:rPr>
+        <w:t xml:space="preserve">Sinon </w:t>
+      </w:r>
+      <w:r>
+        <w:rPr>
+          <w:sz w:val="28"/>
+          <w:szCs w:val="28"/>
+        </w:rPr>
         <w:t>SI moyenne &lt; 10</w:t>
       </w:r>
     </w:p>
@@ -980,24 +1062,47 @@
           <w:szCs w:val="28"/>
         </w:rPr>
       </w:pPr>
-    </w:p>
-    <w:p>
-      <w:pPr>
-        <w:rPr>
-          <w:sz w:val="28"/>
-          <w:szCs w:val="28"/>
-        </w:rPr>
-      </w:pPr>
-    </w:p>
-    <w:p>
-      <w:pPr>
-        <w:rPr>
-          <w:sz w:val="28"/>
-          <w:szCs w:val="28"/>
-        </w:rPr>
-      </w:pPr>
+      <w:r>
+        <w:rPr>
+          <w:sz w:val="28"/>
+          <w:szCs w:val="28"/>
+        </w:rPr>
+        <w:tab/>
+        <w:t>FIN SI</w:t>
+      </w:r>
+    </w:p>
+    <w:p>
+      <w:pPr>
+        <w:rPr>
+          <w:sz w:val="28"/>
+          <w:szCs w:val="28"/>
+        </w:rPr>
+      </w:pPr>
+      <w:r>
+        <w:rPr>
+          <w:sz w:val="28"/>
+          <w:szCs w:val="28"/>
+        </w:rPr>
+        <w:t>FIN FONCTION</w:t>
+      </w:r>
       <w:bookmarkStart w:id="0" w:name="_GoBack"/>
       <w:bookmarkEnd w:id="0"/>
+    </w:p>
+    <w:p>
+      <w:pPr>
+        <w:rPr>
+          <w:sz w:val="28"/>
+          <w:szCs w:val="28"/>
+        </w:rPr>
+      </w:pPr>
+    </w:p>
+    <w:p>
+      <w:pPr>
+        <w:rPr>
+          <w:sz w:val="28"/>
+          <w:szCs w:val="28"/>
+        </w:rPr>
+      </w:pPr>
     </w:p>
     <w:p>
       <w:pPr>

</xml_diff>